<commit_message>
sửa lại nội dung các phần
</commit_message>
<xml_diff>
--- a/handoff/phuc/cost-example.docx
+++ b/handoff/phuc/cost-example.docx
@@ -50,7 +50,7 @@
         <w:rPr>
           <w:lang w:val="vi-VN"/>
         </w:rPr>
-        <w:t xml:space="preserve">Tài liệu dùng lời giải thật trên màn 2 và màn 4 để tính chi phí từng hành động theo P01. Màn 2 minh họa mức phạt cho một hoặc hai ô cam. Màn 4 minh họa trạng thái cầu, tách khối, SPACE và ghép lại. Phần so sánh bổ sung màn 33 cho thấy hai lời giải có cùng số hành động nhưng khác chi phí.</w:t>
+        <w:t xml:space="preserve">Tài liệu dùng lời giải thật trên màn 2 và màn 4 để tính chi phí từng hành động theo P01. Màn 2 minh họa mức phạt cho một hoặc hai ô cam. Màn 4 minh họa trạng thái cầu, tách khối, lệnh đổi khối rồi lăn và ghép lại. Phần so sánh bổ sung màn 33 cho thấy hai lời giải có cùng số hành động nhưng khác chi phí.</w:t>
       </w:r>
     </w:p>
     <w:p>
@@ -62,7 +62,7 @@
         <w:rPr>
           <w:lang w:val="vi-VN"/>
         </w:rPr>
-        <w:t xml:space="preserve">Ngày kiểm chứng là 29/10/2026. Đây là lượt kiểm tra tính đúng cho P02, không phải bộ benchmark chính thức của Quân. Các ví dụ giả định được ghi riêng và không gán cho một màn đã đo.</w:t>
+        <w:t xml:space="preserve">Ngày kiểm chứng là 30/10/2026, sau khi cập nhật mô hình tám hướng và chọn khối miễn phí từ main. Đây là lượt kiểm tra tính đúng cho P02, không phải bộ benchmark chính thức của Quân. Các ví dụ giả định được ghi riêng và không gán cho một màn đã đo.</w:t>
       </w:r>
     </w:p>
     <w:p>
@@ -87,7 +87,7 @@
           <w:rStyle w:val="VerbatimChar"/>
           <w:lang w:val="vi-VN"/>
         </w:rPr>
-        <w:t xml:space="preserve">572156d7f596372a59bb9ad2e8e6ed200b3162d1</w:t>
+        <w:t xml:space="preserve">721c198dfc2a6fff92d451a763015d974fa3b52a</w:t>
       </w:r>
       <w:r>
         <w:rPr>
@@ -361,7 +361,7 @@
         <w:rPr>
           <w:lang w:val="vi-VN"/>
         </w:rPr>
-        <w:t xml:space="preserve">là số ô cam mà toàn bộ khối chiếm giữ.</w:t>
+        <w:t xml:space="preserve">là số ô cam mà toàn bộ khối chiếm giữ sau bước lăn.</w:t>
       </w:r>
       <w:r>
         <w:rPr>
@@ -496,7 +496,7 @@
         <w:rPr>
           <w:lang w:val="vi-VN"/>
         </w:rPr>
-        <w:t xml:space="preserve">tại đích. SPACE vẫn có chi phí dù không đổi tọa độ. [1]</w:t>
+        <w:t xml:space="preserve">tại đích. Lệnh có tiền tố S đổi khối rồi lăn trong một cạnh và chỉ tính cost một lần. SPACE chơi tay miễn phí, không nằm trong lời giải solver. [1]</w:t>
       </w:r>
     </w:p>
     <w:p>
@@ -627,7 +627,7 @@
         <w:rPr>
           <w:lang w:val="vi-VN"/>
         </w:rPr>
-        <w:t xml:space="preserve">Trong tài liệu, “số hành động” là</w:t>
+        <w:t xml:space="preserve">Trong tài liệu, số hành động và số bước lăn đều bằng</w:t>
       </w:r>
       <w:r>
         <w:rPr>
@@ -646,7 +646,7 @@
         <w:rPr>
           <w:lang w:val="vi-VN"/>
         </w:rPr>
-        <w:t xml:space="preserve">, kể cả SPACE. “Số bước lăn” đếm các hành động còn lại và tương ứng</w:t>
+        <w:t xml:space="preserve">, tương ứng</w:t>
       </w:r>
       <w:r>
         <w:rPr>
@@ -671,7 +671,7 @@
         <w:rPr>
           <w:lang w:val="vi-VN"/>
         </w:rPr>
-        <w:t xml:space="preserve">của API. Cả hai ví dụ dưới đây đều dùng chi phí có trọng số khi so BFS và UCS.</w:t>
+        <w:t xml:space="preserve">của API. Mỗi phần tử là một trong tám hướng của</w:t>
       </w:r>
       <w:r>
         <w:rPr>
@@ -684,6 +684,25 @@
           <w:rStyle w:val="VerbatimChar"/>
           <w:lang w:val="vi-VN"/>
         </w:rPr>
+        <w:t xml:space="preserve">SEARCH_ACTIONS</w:t>
+      </w:r>
+      <w:r>
+        <w:rPr>
+          <w:lang w:val="vi-VN"/>
+        </w:rPr>
+        <w:t xml:space="preserve">, không có SPACE. Cả hai ví dụ dưới đây đều dùng chi phí có trọng số khi so BFS và UCS.</w:t>
+      </w:r>
+      <w:r>
+        <w:rPr>
+          <w:lang w:val="vi-VN"/>
+        </w:rPr>
+        <w:t xml:space="preserve"> </w:t>
+      </w:r>
+      <w:r>
+        <w:rPr>
+          <w:rStyle w:val="VerbatimChar"/>
+          <w:lang w:val="vi-VN"/>
+        </w:rPr>
         <w:t xml:space="preserve">total_cost</w:t>
       </w:r>
       <w:r>
@@ -696,7 +715,7 @@
         <w:rPr>
           <w:lang w:val="vi-VN"/>
         </w:rPr>
-        <w:t xml:space="preserve">gốc của BFS chỉ là số bước lăn, nên được phân biệt với</w:t>
+        <w:t xml:space="preserve">gốc của BFS là số hành động lăn, còn</w:t>
       </w:r>
       <w:r>
         <w:rPr>
@@ -715,7 +734,13 @@
         <w:rPr>
           <w:lang w:val="vi-VN"/>
         </w:rPr>
-        <w:t xml:space="preserve">.</w:t>
+        <w:t xml:space="preserve"> </w:t>
+      </w:r>
+      <w:r>
+        <w:rPr>
+          <w:lang w:val="vi-VN"/>
+        </w:rPr>
+        <w:t xml:space="preserve">là cost chung theo P01.</w:t>
       </w:r>
     </w:p>
     <w:p>
@@ -787,7 +812,7 @@
           <w:rStyle w:val="VerbatimChar"/>
           <w:lang w:val="vi-VN"/>
         </w:rPr>
-        <w:t xml:space="preserve">Src/levels/level_2_fragile.json</w:t>
+        <w:t xml:space="preserve">Src/levels/level_02.json</w:t>
       </w:r>
       <w:r>
         <w:rPr>
@@ -2752,7 +2777,7 @@
           <w:rStyle w:val="VerbatimChar"/>
           <w:lang w:val="vi-VN"/>
         </w:rPr>
-        <w:t xml:space="preserve">Src/levels/level_4_combined.json</w:t>
+        <w:t xml:space="preserve">Src/levels/level_04.json</w:t>
       </w:r>
       <w:r>
         <w:rPr>
@@ -4531,7 +4556,7 @@
         <w:rPr>
           <w:lang w:val="vi-VN"/>
         </w:rPr>
-        <w:t xml:space="preserve">Phần tiếp theo giữ nguyên cách tính tích lũy, từ bước 10 đến đích.</w:t>
+        <w:t xml:space="preserve">Phần tiếp theo giữ nguyên cách tính tích lũy, từ bước 10 đến đích. Lệnh SUP thay cho hai thao tác chơi tay SPACE rồi UP.</w:t>
       </w:r>
     </w:p>
     <w:tbl>
@@ -4747,7 +4772,7 @@
                 <w:sz w:val="21"/>
                 <w:lang w:val="vi-VN"/>
               </w:rPr>
-              <w:t xml:space="preserve">SPACE</w:t>
+              <w:t xml:space="preserve">SUP</w:t>
             </w:r>
           </w:p>
         </w:tc>
@@ -4767,7 +4792,7 @@
                 <w:sz w:val="21"/>
                 <w:lang w:val="vi-VN"/>
               </w:rPr>
-              <w:t xml:space="preserve">T(0,9;2,4;1;1)</w:t>
+              <w:t xml:space="preserve">T(0,9;1,4;1;1)</w:t>
             </w:r>
           </w:p>
         </w:tc>
@@ -4876,7 +4901,7 @@
                 <w:sz w:val="21"/>
                 <w:lang w:val="vi-VN"/>
               </w:rPr>
-              <w:t xml:space="preserve">UP</w:t>
+              <w:t xml:space="preserve">RIGHT</w:t>
             </w:r>
           </w:p>
         </w:tc>
@@ -4896,7 +4921,7 @@
                 <w:sz w:val="21"/>
                 <w:lang w:val="vi-VN"/>
               </w:rPr>
-              <w:t xml:space="preserve">T(0,9;1,4;1;1)</w:t>
+              <w:t xml:space="preserve">T(0,9;1,5;1;1)</w:t>
             </w:r>
           </w:p>
         </w:tc>
@@ -5025,7 +5050,7 @@
                 <w:sz w:val="21"/>
                 <w:lang w:val="vi-VN"/>
               </w:rPr>
-              <w:t xml:space="preserve">T(0,9;1,5;1;1)</w:t>
+              <w:t xml:space="preserve">T(0,9;1,6;1;1)</w:t>
             </w:r>
           </w:p>
         </w:tc>
@@ -5154,7 +5179,7 @@
                 <w:sz w:val="21"/>
                 <w:lang w:val="vi-VN"/>
               </w:rPr>
-              <w:t xml:space="preserve">T(0,9;1,6;1;1)</w:t>
+              <w:t xml:space="preserve">T(0,9;1,7;1;1)</w:t>
             </w:r>
           </w:p>
         </w:tc>
@@ -5283,7 +5308,7 @@
                 <w:sz w:val="21"/>
                 <w:lang w:val="vi-VN"/>
               </w:rPr>
-              <w:t xml:space="preserve">T(0,9;1,7;1;1)</w:t>
+              <w:t xml:space="preserve">T(0,9;1,8;1;1)</w:t>
             </w:r>
           </w:p>
         </w:tc>
@@ -5412,7 +5437,7 @@
                 <w:sz w:val="21"/>
                 <w:lang w:val="vi-VN"/>
               </w:rPr>
-              <w:t xml:space="preserve">T(0,9;1,8;1;1)</w:t>
+              <w:t xml:space="preserve">V(0,9;1)</w:t>
             </w:r>
           </w:p>
         </w:tc>
@@ -5521,7 +5546,7 @@
                 <w:sz w:val="21"/>
                 <w:lang w:val="vi-VN"/>
               </w:rPr>
-              <w:t xml:space="preserve">RIGHT</w:t>
+              <w:t xml:space="preserve">DOWN</w:t>
             </w:r>
           </w:p>
         </w:tc>
@@ -5541,7 +5566,7 @@
                 <w:sz w:val="21"/>
                 <w:lang w:val="vi-VN"/>
               </w:rPr>
-              <w:t xml:space="preserve">V(0,9;1)</w:t>
+              <w:t xml:space="preserve">S(2,9;1), đích</w:t>
             </w:r>
           </w:p>
         </w:tc>
@@ -5605,135 +5630,6 @@
                 <w:lang w:val="vi-VN"/>
               </w:rPr>
               <w:t xml:space="preserve">16,5</w:t>
-            </w:r>
-          </w:p>
-        </w:tc>
-      </w:tr>
-      <w:tr>
-        <w:trPr>
-          <w:cantSplit/>
-        </w:trPr>
-        <w:tc>
-          <w:tcPr>
-            <w:tcW w:type="dxa" w:w="567"/>
-            <w:vAlign w:val="center"/>
-          </w:tcPr>
-          <w:p>
-            <w:pPr>
-              <w:pStyle w:val="Compact"/>
-              <w:spacing w:line="240" w:lineRule="auto" w:after="60" w:before="60"/>
-              <w:jc w:val="right"/>
-            </w:pPr>
-            <w:r>
-              <w:rPr>
-                <w:color w:val="000000"/>
-                <w:sz w:val="21"/>
-                <w:lang w:val="vi-VN"/>
-              </w:rPr>
-              <w:t xml:space="preserve">17</w:t>
-            </w:r>
-          </w:p>
-        </w:tc>
-        <w:tc>
-          <w:tcPr>
-            <w:tcW w:type="dxa" w:w="1191"/>
-            <w:vAlign w:val="center"/>
-          </w:tcPr>
-          <w:p>
-            <w:pPr>
-              <w:pStyle w:val="Compact"/>
-              <w:spacing w:line="240" w:lineRule="auto" w:after="60" w:before="60"/>
-            </w:pPr>
-            <w:r>
-              <w:rPr>
-                <w:color w:val="000000"/>
-                <w:sz w:val="21"/>
-                <w:lang w:val="vi-VN"/>
-              </w:rPr>
-              <w:t xml:space="preserve">DOWN</w:t>
-            </w:r>
-          </w:p>
-        </w:tc>
-        <w:tc>
-          <w:tcPr>
-            <w:tcW w:type="dxa" w:w="3402"/>
-            <w:vAlign w:val="center"/>
-          </w:tcPr>
-          <w:p>
-            <w:pPr>
-              <w:pStyle w:val="Compact"/>
-              <w:spacing w:line="240" w:lineRule="auto" w:after="60" w:before="60"/>
-            </w:pPr>
-            <w:r>
-              <w:rPr>
-                <w:color w:val="000000"/>
-                <w:sz w:val="21"/>
-                <w:lang w:val="vi-VN"/>
-              </w:rPr>
-              <w:t xml:space="preserve">S(2,9;1), đích</w:t>
-            </w:r>
-          </w:p>
-        </w:tc>
-        <w:tc>
-          <w:tcPr>
-            <w:tcW w:type="dxa" w:w="1077"/>
-            <w:vAlign w:val="center"/>
-          </w:tcPr>
-          <w:p>
-            <w:pPr>
-              <w:pStyle w:val="Compact"/>
-              <w:spacing w:line="240" w:lineRule="auto" w:after="60" w:before="60"/>
-              <w:jc w:val="right"/>
-            </w:pPr>
-            <w:r>
-              <w:rPr>
-                <w:color w:val="000000"/>
-                <w:sz w:val="21"/>
-                <w:lang w:val="vi-VN"/>
-              </w:rPr>
-              <w:t xml:space="preserve">0</w:t>
-            </w:r>
-          </w:p>
-        </w:tc>
-        <w:tc>
-          <w:tcPr>
-            <w:tcW w:type="dxa" w:w="1644"/>
-            <w:vAlign w:val="center"/>
-          </w:tcPr>
-          <w:p>
-            <w:pPr>
-              <w:pStyle w:val="Compact"/>
-              <w:spacing w:line="240" w:lineRule="auto" w:after="60" w:before="60"/>
-              <w:jc w:val="right"/>
-            </w:pPr>
-            <w:r>
-              <w:rPr>
-                <w:color w:val="000000"/>
-                <w:sz w:val="21"/>
-                <w:lang w:val="vi-VN"/>
-              </w:rPr>
-              <w:t xml:space="preserve">1,0</w:t>
-            </w:r>
-          </w:p>
-        </w:tc>
-        <w:tc>
-          <w:tcPr>
-            <w:tcW w:type="dxa" w:w="1644"/>
-            <w:vAlign w:val="center"/>
-          </w:tcPr>
-          <w:p>
-            <w:pPr>
-              <w:pStyle w:val="Compact"/>
-              <w:spacing w:line="240" w:lineRule="auto" w:after="60" w:before="60"/>
-              <w:jc w:val="right"/>
-            </w:pPr>
-            <w:r>
-              <w:rPr>
-                <w:color w:val="000000"/>
-                <w:sz w:val="21"/>
-                <w:lang w:val="vi-VN"/>
-              </w:rPr>
-              <w:t xml:space="preserve">17,5</w:t>
             </w:r>
           </w:p>
         </w:tc>
@@ -5783,7 +5679,7 @@
         <w:rPr>
           <w:lang w:val="vi-VN"/>
         </w:rPr>
-        <w:t xml:space="preserve">Ở bước 10, SPACE chỉ đổi</w:t>
+        <w:t xml:space="preserve">Ở bước 10, SUP đổi điều khiển sang khối đơn 1 rồi lăn khối này lên</w:t>
       </w:r>
       <w:r>
         <w:rPr>
@@ -5796,19 +5692,13 @@
           <w:rStyle w:val="VerbatimChar"/>
           <w:lang w:val="vi-VN"/>
         </w:rPr>
-        <w:t xml:space="preserve">active_cube</w:t>
-      </w:r>
-      <w:r>
-        <w:rPr>
-          <w:lang w:val="vi-VN"/>
-        </w:rPr>
-        <w:t xml:space="preserve"> </w:t>
-      </w:r>
-      <w:r>
-        <w:rPr>
-          <w:lang w:val="vi-VN"/>
-        </w:rPr>
-        <w:t xml:space="preserve">từ 0 sang 1. Hai tọa độ giữ nguyên, nhưng hành động vẫn làm cost tăng từ 9,5 lên 10,5. Ở bước 16, hai khối đơn ghép thành khối nằm dọc và các trường phụ trở về mặc định. Bước 17 kết thúc tại đích.</w:t>
+        <w:t xml:space="preserve">(1,4)</w:t>
+      </w:r>
+      <w:r>
+        <w:rPr>
+          <w:lang w:val="vi-VN"/>
+        </w:rPr>
+        <w:t xml:space="preserve">. Toàn bộ lệnh chỉ có cost 1, nên chi phí tăng từ 9,5 lên 10,5. Không có trạng thái chọn khối đứng riêng trong bảng lời giải. Ở bước 15, hai khối đơn ghép thành khối nằm dọc và các trường phụ trở về mặc định. Bước 16 kết thúc tại đích.</w:t>
       </w:r>
     </w:p>
     <w:p>
@@ -5820,7 +5710,7 @@
         <w:rPr>
           <w:lang w:val="vi-VN"/>
         </w:rPr>
-        <w:t xml:space="preserve">Tổng cộng có 17 hành động, gồm 16 bước lăn và một SPACE. Chỉ trạng thái sau bước 1 chiếm một ô cam, nên chi phí bằng</w:t>
+        <w:t xml:space="preserve">Tổng cộng có 16 hành động lăn, gồm một lệnh SUP. Chỉ trạng thái sau bước 1 chiếm một ô cam, nên chi phí bằng</w:t>
       </w:r>
       <w:r>
         <w:rPr>
@@ -5830,7 +5720,7 @@
       </w:r>
       <m:oMath>
         <m:r>
-          <m:t>17</m:t>
+          <m:t>16</m:t>
         </m:r>
         <m:r>
           <m:rPr>
@@ -5857,7 +5747,7 @@
           <m:t>=</m:t>
         </m:r>
         <m:r>
-          <m:t>17.5</m:t>
+          <m:t>16.5</m:t>
         </m:r>
       </m:oMath>
       <w:r>
@@ -6071,7 +5961,7 @@
                 <w:sz w:val="21"/>
                 <w:lang w:val="vi-VN"/>
               </w:rPr>
-              <w:t xml:space="preserve">17</w:t>
+              <w:t xml:space="preserve">16</w:t>
             </w:r>
           </w:p>
         </w:tc>
@@ -6134,7 +6024,7 @@
                 <w:sz w:val="21"/>
                 <w:lang w:val="vi-VN"/>
               </w:rPr>
-              <w:t xml:space="preserve">17,5</w:t>
+              <w:t xml:space="preserve">16,5</w:t>
             </w:r>
           </w:p>
         </w:tc>
@@ -6180,7 +6070,7 @@
                 <w:sz w:val="21"/>
                 <w:lang w:val="vi-VN"/>
               </w:rPr>
-              <w:t xml:space="preserve">17</w:t>
+              <w:t xml:space="preserve">16</w:t>
             </w:r>
           </w:p>
         </w:tc>
@@ -6222,7 +6112,7 @@
                 <w:sz w:val="21"/>
                 <w:lang w:val="vi-VN"/>
               </w:rPr>
-              <w:t xml:space="preserve">17,5</w:t>
+              <w:t xml:space="preserve">16,5</w:t>
             </w:r>
           </w:p>
         </w:tc>
@@ -6243,7 +6133,7 @@
                 <w:sz w:val="21"/>
                 <w:lang w:val="vi-VN"/>
               </w:rPr>
-              <w:t xml:space="preserve">17,5</w:t>
+              <w:t xml:space="preserve">16,5</w:t>
             </w:r>
           </w:p>
         </w:tc>
@@ -6258,48 +6148,7 @@
         <w:rPr>
           <w:lang w:val="vi-VN"/>
         </w:rPr>
-        <w:t xml:space="preserve">BFS và UCS trả cùng chuỗi trong lượt kiểm chứng này. Phép tính</w:t>
-      </w:r>
-      <w:r>
-        <w:rPr>
-          <w:lang w:val="vi-VN"/>
-        </w:rPr>
-        <w:t xml:space="preserve"> </w:t>
-      </w:r>
-      <m:oMath>
-        <m:r>
-          <m:t>16</m:t>
-        </m:r>
-        <m:r>
-          <m:rPr>
-            <m:sty m:val="p"/>
-          </m:rPr>
-          <m:t>+</m:t>
-        </m:r>
-        <m:r>
-          <m:t>0.5</m:t>
-        </m:r>
-        <m:r>
-          <m:rPr>
-            <m:sty m:val="p"/>
-          </m:rPr>
-          <m:t>=</m:t>
-        </m:r>
-        <m:r>
-          <m:t>16.5</m:t>
-        </m:r>
-      </m:oMath>
-      <w:r>
-        <w:rPr>
-          <w:lang w:val="vi-VN"/>
-        </w:rPr>
-        <w:t xml:space="preserve"> </w:t>
-      </w:r>
-      <w:r>
-        <w:rPr>
-          <w:lang w:val="vi-VN"/>
-        </w:rPr>
-        <w:t xml:space="preserve">sẽ bỏ sót chi phí cơ bản của SPACE và không khớp replay. Tổng đúng là 17,5.</w:t>
+        <w:t xml:space="preserve">BFS và UCS trả cùng chuỗi trong lượt kiểm chứng này. Tổng đúng theo mô hình mới là 16,5. Giá trị 17,5 trong tài liệu cũ đã cộng phí cho SPACE riêng và không còn áp dụng cho lời giải hiện tại.</w:t>
       </w:r>
     </w:p>
     <w:p>
@@ -6364,13 +6213,38 @@
         <w:rPr>
           <w:lang w:val="vi-VN"/>
         </w:rPr>
-        <w:t xml:space="preserve">và cùng hai core BFS/UCS tại commit đã ghi. Cả hai đường đều replay hợp lệ tới đích. Bảng dưới đây chỉ tổng hợp chất lượng đường đi, không trình bày 119 dòng trạng thái và không dùng làm số liệu hiệu năng chính thức.</w:t>
+        <w:t xml:space="preserve">trong</w:t>
+      </w:r>
+      <w:r>
+        <w:rPr>
+          <w:lang w:val="vi-VN"/>
+        </w:rPr>
+        <w:t xml:space="preserve"> </w:t>
+      </w:r>
+      <w:r>
+        <w:rPr>
+          <w:rStyle w:val="VerbatimChar"/>
+          <w:lang w:val="vi-VN"/>
+        </w:rPr>
+        <w:t xml:space="preserve">Src/levels/level_33.json</w:t>
+      </w:r>
+      <w:r>
+        <w:rPr>
+          <w:lang w:val="vi-VN"/>
+        </w:rPr>
+        <w:t xml:space="preserve"> </w:t>
+      </w:r>
+      <w:r>
+        <w:rPr>
+          <w:lang w:val="vi-VN"/>
+        </w:rPr>
+        <w:t xml:space="preserve">và cùng hai core BFS/UCS tại commit đã ghi. Cả hai đường đều replay hợp lệ tới đích. Bảng dưới chỉ tổng hợp chất lượng đường đi, không trình bày 110 dòng trạng thái và không dùng làm số liệu hiệu năng chính thức.</w:t>
       </w:r>
     </w:p>
     <w:tbl>
       <w:tblPr>
         <w:tblStyle w:val="Table"/>
-        <w:tblW w:type="auto" w:w="0"/>
+        <w:tblW w:type="pct" w:w="5000"/>
         <w:tblLayout w:type="fixed"/>
         <w:tblLook w:firstRow="1" w:lastRow="0" w:firstColumn="0" w:lastColumn="0" w:noHBand="0" w:noVBand="0" w:val="0020"/>
         <w:tblBorders>
@@ -6488,7 +6362,7 @@
                 <w:sz w:val="21"/>
                 <w:lang w:val="vi-VN"/>
               </w:rPr>
-              <w:t xml:space="preserve">Số SPACE</w:t>
+              <w:t xml:space="preserve">Số lệnh tiền tố S</w:t>
             </w:r>
           </w:p>
         </w:tc>
@@ -6557,7 +6431,7 @@
                 <w:sz w:val="21"/>
                 <w:lang w:val="vi-VN"/>
               </w:rPr>
-              <w:t xml:space="preserve">119</w:t>
+              <w:t xml:space="preserve">110</w:t>
             </w:r>
           </w:p>
         </w:tc>
@@ -6620,7 +6494,7 @@
                 <w:sz w:val="21"/>
                 <w:lang w:val="vi-VN"/>
               </w:rPr>
-              <w:t xml:space="preserve">120,0</w:t>
+              <w:t xml:space="preserve">111,5</w:t>
             </w:r>
           </w:p>
         </w:tc>
@@ -6666,7 +6540,7 @@
                 <w:sz w:val="21"/>
                 <w:lang w:val="vi-VN"/>
               </w:rPr>
-              <w:t xml:space="preserve">119</w:t>
+              <w:t xml:space="preserve">110</w:t>
             </w:r>
           </w:p>
         </w:tc>
@@ -6708,7 +6582,7 @@
                 <w:sz w:val="21"/>
                 <w:lang w:val="vi-VN"/>
               </w:rPr>
-              <w:t xml:space="preserve">9</w:t>
+              <w:t xml:space="preserve">10</w:t>
             </w:r>
           </w:p>
         </w:tc>
@@ -6729,7 +6603,7 @@
                 <w:sz w:val="21"/>
                 <w:lang w:val="vi-VN"/>
               </w:rPr>
-              <w:t xml:space="preserve">119,5</w:t>
+              <w:t xml:space="preserve">110,5</w:t>
             </w:r>
           </w:p>
         </w:tc>
@@ -6744,7 +6618,7 @@
         <w:rPr>
           <w:lang w:val="vi-VN"/>
         </w:rPr>
-        <w:t xml:space="preserve">Hai đường có cùng số hành động và số bước lăn, nhưng UCS giảm cost 0,5. Theo công thức P01, đường BFS có hai lượt tiếp xúc ô cam, còn đường UCS có một lượt. Vì vậy, tối ưu số hành động không phân biệt được chất lượng của hai đường này, trong khi cost có trọng số phân biệt được. Chi phí 119,5 khớp mốc</w:t>
+        <w:t xml:space="preserve">Hai đường có cùng số hành động và số bước lăn, nhưng UCS giảm cost 1,0. Theo công thức P01, đường BFS có ba lượt tiếp xúc ô cam, còn đường UCS có một lượt. Số lệnh tiền tố S khác nhau không làm đổi tổng số bước vì mỗi lệnh vẫn gồm đúng một bước lăn. Chi phí 110,5 khớp mốc</w:t>
       </w:r>
       <w:r>
         <w:rPr>
@@ -6789,6 +6663,43 @@
           <w:lang w:val="vi-VN"/>
         </w:rPr>
         <w:t xml:space="preserve">. [2]</w:t>
+      </w:r>
+    </w:p>
+    <w:p>
+      <w:pPr>
+        <w:pStyle w:val="BodyText"/>
+        <w:widowControl/>
+      </w:pPr>
+      <w:r>
+        <w:rPr>
+          <w:lang w:val="vi-VN"/>
+        </w:rPr>
+        <w:t xml:space="preserve">Đường mẫu trong</w:t>
+      </w:r>
+      <w:r>
+        <w:rPr>
+          <w:lang w:val="vi-VN"/>
+        </w:rPr>
+        <w:t xml:space="preserve"> </w:t>
+      </w:r>
+      <w:r>
+        <w:rPr>
+          <w:rStyle w:val="VerbatimChar"/>
+          <w:lang w:val="vi-VN"/>
+        </w:rPr>
+        <w:t xml:space="preserve">test_cases.json</w:t>
+      </w:r>
+      <w:r>
+        <w:rPr>
+          <w:lang w:val="vi-VN"/>
+        </w:rPr>
+        <w:t xml:space="preserve"> </w:t>
+      </w:r>
+      <w:r>
+        <w:rPr>
+          <w:lang w:val="vi-VN"/>
+        </w:rPr>
+        <w:t xml:space="preserve">có cost 111,0. Đây là đường khác với đường BFS hiện trả, nên không dùng giá trị đường mẫu để thay cost BFS 111,5. Các số trên được chạy lại, không suy ra bằng cách lấy cost cũ trừ số SPACE.</w:t>
       </w:r>
     </w:p>
     <w:p>
@@ -7241,7 +7152,7 @@
         <w:rPr>
           <w:lang w:val="vi-VN"/>
         </w:rPr>
-        <w:t xml:space="preserve">là kết quả của lượt kiểm chứng ngày 29/10/2026 nêu trong tài liệu.</w:t>
+        <w:t xml:space="preserve">là kết quả của lượt kiểm chứng ngày 30/10/2026 nêu trong tài liệu.</w:t>
       </w:r>
     </w:p>
     <w:p>
@@ -7273,7 +7184,7 @@
         <w:rPr>
           <w:rStyle w:val="NormalTok"/>
         </w:rPr>
-        <w:t xml:space="preserve"> load_cases, replay_solution</w:t>
+        <w:t xml:space="preserve"> load_cases</w:t>
       </w:r>
       <w:r>
         <w:br/>
@@ -7288,6 +7199,60 @@
         <w:rPr>
           <w:rStyle w:val="NormalTok"/>
         </w:rPr>
+        <w:t xml:space="preserve"> core.board </w:t>
+      </w:r>
+      <w:r>
+        <w:rPr>
+          <w:rStyle w:val="ImportTok"/>
+        </w:rPr>
+        <w:t xml:space="preserve">import</w:t>
+      </w:r>
+      <w:r>
+        <w:rPr>
+          <w:rStyle w:val="NormalTok"/>
+        </w:rPr>
+        <w:t xml:space="preserve"> SEARCH_ACTIONS</w:t>
+      </w:r>
+      <w:r>
+        <w:br/>
+      </w:r>
+      <w:r>
+        <w:rPr>
+          <w:rStyle w:val="ImportTok"/>
+        </w:rPr>
+        <w:t xml:space="preserve">from</w:t>
+      </w:r>
+      <w:r>
+        <w:rPr>
+          <w:rStyle w:val="NormalTok"/>
+        </w:rPr>
+        <w:t xml:space="preserve"> core.replay </w:t>
+      </w:r>
+      <w:r>
+        <w:rPr>
+          <w:rStyle w:val="ImportTok"/>
+        </w:rPr>
+        <w:t xml:space="preserve">import</w:t>
+      </w:r>
+      <w:r>
+        <w:rPr>
+          <w:rStyle w:val="NormalTok"/>
+        </w:rPr>
+        <w:t xml:space="preserve"> replay_solution</w:t>
+      </w:r>
+      <w:r>
+        <w:br/>
+      </w:r>
+      <w:r>
+        <w:rPr>
+          <w:rStyle w:val="ImportTok"/>
+        </w:rPr>
+        <w:t xml:space="preserve">from</w:t>
+      </w:r>
+      <w:r>
+        <w:rPr>
+          <w:rStyle w:val="NormalTok"/>
+        </w:rPr>
         <w:t xml:space="preserve"> solvers.member3_bfs </w:t>
       </w:r>
       <w:r>
@@ -7564,7 +7529,7 @@
         <w:rPr>
           <w:rStyle w:val="DecValTok"/>
         </w:rPr>
-        <w:t xml:space="preserve">17</w:t>
+        <w:t xml:space="preserve">16</w:t>
       </w:r>
       <w:r>
         <w:rPr>
@@ -7588,7 +7553,7 @@
         <w:rPr>
           <w:rStyle w:val="FloatTok"/>
         </w:rPr>
-        <w:t xml:space="preserve">17.5</w:t>
+        <w:t xml:space="preserve">16.5</w:t>
       </w:r>
       <w:r>
         <w:rPr>
@@ -7612,7 +7577,7 @@
         <w:rPr>
           <w:rStyle w:val="DecValTok"/>
         </w:rPr>
-        <w:t xml:space="preserve">17</w:t>
+        <w:t xml:space="preserve">16</w:t>
       </w:r>
       <w:r>
         <w:rPr>
@@ -7636,7 +7601,7 @@
         <w:rPr>
           <w:rStyle w:val="FloatTok"/>
         </w:rPr>
-        <w:t xml:space="preserve">17.5</w:t>
+        <w:t xml:space="preserve">16.5</w:t>
       </w:r>
       <w:r>
         <w:rPr>
@@ -7681,7 +7646,7 @@
         <w:rPr>
           <w:rStyle w:val="DecValTok"/>
         </w:rPr>
-        <w:t xml:space="preserve">119</w:t>
+        <w:t xml:space="preserve">110</w:t>
       </w:r>
       <w:r>
         <w:rPr>
@@ -7705,7 +7670,7 @@
         <w:rPr>
           <w:rStyle w:val="FloatTok"/>
         </w:rPr>
-        <w:t xml:space="preserve">120.0</w:t>
+        <w:t xml:space="preserve">111.5</w:t>
       </w:r>
       <w:r>
         <w:rPr>
@@ -7738,7 +7703,7 @@
         <w:rPr>
           <w:rStyle w:val="DecValTok"/>
         </w:rPr>
-        <w:t xml:space="preserve">119</w:t>
+        <w:t xml:space="preserve">110</w:t>
       </w:r>
       <w:r>
         <w:rPr>
@@ -7762,7 +7727,7 @@
         <w:rPr>
           <w:rStyle w:val="FloatTok"/>
         </w:rPr>
-        <w:t xml:space="preserve">119.5</w:t>
+        <w:t xml:space="preserve">110.5</w:t>
       </w:r>
       <w:r>
         <w:rPr>
@@ -8002,6 +7967,87 @@
         <w:rPr>
           <w:rStyle w:val="NormalTok"/>
         </w:rPr>
+        <w:t xml:space="preserve">        </w:t>
+      </w:r>
+      <w:r>
+        <w:rPr>
+          <w:rStyle w:val="ControlFlowTok"/>
+        </w:rPr>
+        <w:t xml:space="preserve">assert</w:t>
+      </w:r>
+      <w:r>
+        <w:rPr>
+          <w:rStyle w:val="NormalTok"/>
+        </w:rPr>
+        <w:t xml:space="preserve"> </w:t>
+      </w:r>
+      <w:r>
+        <w:rPr>
+          <w:rStyle w:val="BuiltInTok"/>
+        </w:rPr>
+        <w:t xml:space="preserve">all</w:t>
+      </w:r>
+      <w:r>
+        <w:rPr>
+          <w:rStyle w:val="NormalTok"/>
+        </w:rPr>
+        <w:t xml:space="preserve">(a </w:t>
+      </w:r>
+      <w:r>
+        <w:rPr>
+          <w:rStyle w:val="KeywordTok"/>
+        </w:rPr>
+        <w:t xml:space="preserve">in</w:t>
+      </w:r>
+      <w:r>
+        <w:rPr>
+          <w:rStyle w:val="NormalTok"/>
+        </w:rPr>
+        <w:t xml:space="preserve"> SEARCH_ACTIONS </w:t>
+      </w:r>
+      <w:r>
+        <w:rPr>
+          <w:rStyle w:val="ControlFlowTok"/>
+        </w:rPr>
+        <w:t xml:space="preserve">for</w:t>
+      </w:r>
+      <w:r>
+        <w:rPr>
+          <w:rStyle w:val="NormalTok"/>
+        </w:rPr>
+        <w:t xml:space="preserve"> a </w:t>
+      </w:r>
+      <w:r>
+        <w:rPr>
+          <w:rStyle w:val="KeywordTok"/>
+        </w:rPr>
+        <w:t xml:space="preserve">in</w:t>
+      </w:r>
+      <w:r>
+        <w:rPr>
+          <w:rStyle w:val="NormalTok"/>
+        </w:rPr>
+        <w:t xml:space="preserve"> result[</w:t>
+      </w:r>
+      <w:r>
+        <w:rPr>
+          <w:rStyle w:val="StringTok"/>
+        </w:rPr>
+        <w:t xml:space="preserve">"moves"</w:t>
+      </w:r>
+      <w:r>
+        <w:rPr>
+          <w:rStyle w:val="NormalTok"/>
+        </w:rPr>
+        <w:t xml:space="preserve">])</w:t>
+      </w:r>
+      <w:r>
+        <w:br/>
+      </w:r>
+      <w:r>
+        <w:rPr>
+          <w:rStyle w:val="NormalTok"/>
+        </w:rPr>
         <w:t xml:space="preserve">        actions </w:t>
       </w:r>
       <w:r>
@@ -8065,19 +8111,85 @@
         <w:rPr>
           <w:rStyle w:val="BuiltInTok"/>
         </w:rPr>
-        <w:t xml:space="preserve">sum</w:t>
-      </w:r>
-      <w:r>
-        <w:rPr>
-          <w:rStyle w:val="NormalTok"/>
-        </w:rPr>
-        <w:t xml:space="preserve">(a </w:t>
+        <w:t xml:space="preserve">len</w:t>
+      </w:r>
+      <w:r>
+        <w:rPr>
+          <w:rStyle w:val="NormalTok"/>
+        </w:rPr>
+        <w:t xml:space="preserve">(result[</w:t>
+      </w:r>
+      <w:r>
+        <w:rPr>
+          <w:rStyle w:val="StringTok"/>
+        </w:rPr>
+        <w:t xml:space="preserve">"moves"</w:t>
+      </w:r>
+      <w:r>
+        <w:rPr>
+          <w:rStyle w:val="NormalTok"/>
+        </w:rPr>
+        <w:t xml:space="preserve">])</w:t>
+      </w:r>
+      <w:r>
+        <w:br/>
+      </w:r>
+      <w:r>
+        <w:rPr>
+          <w:rStyle w:val="NormalTok"/>
+        </w:rPr>
+        <w:t xml:space="preserve">        </w:t>
+      </w:r>
+      <w:r>
+        <w:rPr>
+          <w:rStyle w:val="ControlFlowTok"/>
+        </w:rPr>
+        <w:t xml:space="preserve">assert</w:t>
+      </w:r>
+      <w:r>
+        <w:rPr>
+          <w:rStyle w:val="NormalTok"/>
+        </w:rPr>
+        <w:t xml:space="preserve"> (actions, rolls, replay.cost) </w:t>
       </w:r>
       <w:r>
         <w:rPr>
           <w:rStyle w:val="OperatorTok"/>
         </w:rPr>
-        <w:t xml:space="preserve">!=</w:t>
+        <w:t xml:space="preserve">==</w:t>
+      </w:r>
+      <w:r>
+        <w:rPr>
+          <w:rStyle w:val="NormalTok"/>
+        </w:rPr>
+        <w:t xml:space="preserve"> targets[name]</w:t>
+      </w:r>
+      <w:r>
+        <w:br/>
+      </w:r>
+      <w:r>
+        <w:rPr>
+          <w:rStyle w:val="NormalTok"/>
+        </w:rPr>
+        <w:t xml:space="preserve">        </w:t>
+      </w:r>
+      <w:r>
+        <w:rPr>
+          <w:rStyle w:val="ControlFlowTok"/>
+        </w:rPr>
+        <w:t xml:space="preserve">if</w:t>
+      </w:r>
+      <w:r>
+        <w:rPr>
+          <w:rStyle w:val="NormalTok"/>
+        </w:rPr>
+        <w:t xml:space="preserve"> name </w:t>
+      </w:r>
+      <w:r>
+        <w:rPr>
+          <w:rStyle w:val="OperatorTok"/>
+        </w:rPr>
+        <w:t xml:space="preserve">==</w:t>
       </w:r>
       <w:r>
         <w:rPr>
@@ -8089,31 +8201,28 @@
         <w:rPr>
           <w:rStyle w:val="StringTok"/>
         </w:rPr>
-        <w:t xml:space="preserve">"SPACE"</w:t>
-      </w:r>
-      <w:r>
-        <w:rPr>
-          <w:rStyle w:val="NormalTok"/>
-        </w:rPr>
-        <w:t xml:space="preserve"> </w:t>
+        <w:t xml:space="preserve">"ucs"</w:t>
+      </w:r>
+      <w:r>
+        <w:rPr>
+          <w:rStyle w:val="NormalTok"/>
+        </w:rPr>
+        <w:t xml:space="preserve">:</w:t>
+      </w:r>
+      <w:r>
+        <w:br/>
+      </w:r>
+      <w:r>
+        <w:rPr>
+          <w:rStyle w:val="NormalTok"/>
+        </w:rPr>
+        <w:t xml:space="preserve">            </w:t>
       </w:r>
       <w:r>
         <w:rPr>
           <w:rStyle w:val="ControlFlowTok"/>
         </w:rPr>
-        <w:t xml:space="preserve">for</w:t>
-      </w:r>
-      <w:r>
-        <w:rPr>
-          <w:rStyle w:val="NormalTok"/>
-        </w:rPr>
-        <w:t xml:space="preserve"> a </w:t>
-      </w:r>
-      <w:r>
-        <w:rPr>
-          <w:rStyle w:val="KeywordTok"/>
-        </w:rPr>
-        <w:t xml:space="preserve">in</w:t>
+        <w:t xml:space="preserve">assert</w:t>
       </w:r>
       <w:r>
         <w:rPr>
@@ -8125,13 +8234,25 @@
         <w:rPr>
           <w:rStyle w:val="StringTok"/>
         </w:rPr>
-        <w:t xml:space="preserve">"moves"</w:t>
-      </w:r>
-      <w:r>
-        <w:rPr>
-          <w:rStyle w:val="NormalTok"/>
-        </w:rPr>
-        <w:t xml:space="preserve">])</w:t>
+        <w:t xml:space="preserve">"total_cost"</w:t>
+      </w:r>
+      <w:r>
+        <w:rPr>
+          <w:rStyle w:val="NormalTok"/>
+        </w:rPr>
+        <w:t xml:space="preserve">] </w:t>
+      </w:r>
+      <w:r>
+        <w:rPr>
+          <w:rStyle w:val="OperatorTok"/>
+        </w:rPr>
+        <w:t xml:space="preserve">==</w:t>
+      </w:r>
+      <w:r>
+        <w:rPr>
+          <w:rStyle w:val="NormalTok"/>
+        </w:rPr>
+        <w:t xml:space="preserve"> replay.cost</w:t>
       </w:r>
       <w:r>
         <w:br/>
@@ -8146,13 +8267,46 @@
         <w:rPr>
           <w:rStyle w:val="ControlFlowTok"/>
         </w:rPr>
+        <w:t xml:space="preserve">else</w:t>
+      </w:r>
+      <w:r>
+        <w:rPr>
+          <w:rStyle w:val="NormalTok"/>
+        </w:rPr>
+        <w:t xml:space="preserve">:</w:t>
+      </w:r>
+      <w:r>
+        <w:br/>
+      </w:r>
+      <w:r>
+        <w:rPr>
+          <w:rStyle w:val="NormalTok"/>
+        </w:rPr>
+        <w:t xml:space="preserve">            </w:t>
+      </w:r>
+      <w:r>
+        <w:rPr>
+          <w:rStyle w:val="ControlFlowTok"/>
+        </w:rPr>
         <w:t xml:space="preserve">assert</w:t>
       </w:r>
       <w:r>
         <w:rPr>
           <w:rStyle w:val="NormalTok"/>
         </w:rPr>
-        <w:t xml:space="preserve"> (actions, rolls, replay.cost) </w:t>
+        <w:t xml:space="preserve"> result[</w:t>
+      </w:r>
+      <w:r>
+        <w:rPr>
+          <w:rStyle w:val="StringTok"/>
+        </w:rPr>
+        <w:t xml:space="preserve">"total_cost"</w:t>
+      </w:r>
+      <w:r>
+        <w:rPr>
+          <w:rStyle w:val="NormalTok"/>
+        </w:rPr>
+        <w:t xml:space="preserve">] </w:t>
       </w:r>
       <w:r>
         <w:rPr>
@@ -8164,97 +8318,7 @@
         <w:rPr>
           <w:rStyle w:val="NormalTok"/>
         </w:rPr>
-        <w:t xml:space="preserve"> targets[name]</w:t>
-      </w:r>
-      <w:r>
-        <w:br/>
-      </w:r>
-      <w:r>
-        <w:rPr>
-          <w:rStyle w:val="NormalTok"/>
-        </w:rPr>
-        <w:t xml:space="preserve">        </w:t>
-      </w:r>
-      <w:r>
-        <w:rPr>
-          <w:rStyle w:val="ControlFlowTok"/>
-        </w:rPr>
-        <w:t xml:space="preserve">if</w:t>
-      </w:r>
-      <w:r>
-        <w:rPr>
-          <w:rStyle w:val="NormalTok"/>
-        </w:rPr>
-        <w:t xml:space="preserve"> name </w:t>
-      </w:r>
-      <w:r>
-        <w:rPr>
-          <w:rStyle w:val="OperatorTok"/>
-        </w:rPr>
-        <w:t xml:space="preserve">==</w:t>
-      </w:r>
-      <w:r>
-        <w:rPr>
-          <w:rStyle w:val="NormalTok"/>
-        </w:rPr>
-        <w:t xml:space="preserve"> </w:t>
-      </w:r>
-      <w:r>
-        <w:rPr>
-          <w:rStyle w:val="StringTok"/>
-        </w:rPr>
-        <w:t xml:space="preserve">"ucs"</w:t>
-      </w:r>
-      <w:r>
-        <w:rPr>
-          <w:rStyle w:val="NormalTok"/>
-        </w:rPr>
-        <w:t xml:space="preserve">:</w:t>
-      </w:r>
-      <w:r>
-        <w:br/>
-      </w:r>
-      <w:r>
-        <w:rPr>
-          <w:rStyle w:val="NormalTok"/>
-        </w:rPr>
-        <w:t xml:space="preserve">            </w:t>
-      </w:r>
-      <w:r>
-        <w:rPr>
-          <w:rStyle w:val="ControlFlowTok"/>
-        </w:rPr>
-        <w:t xml:space="preserve">assert</w:t>
-      </w:r>
-      <w:r>
-        <w:rPr>
-          <w:rStyle w:val="NormalTok"/>
-        </w:rPr>
-        <w:t xml:space="preserve"> result[</w:t>
-      </w:r>
-      <w:r>
-        <w:rPr>
-          <w:rStyle w:val="StringTok"/>
-        </w:rPr>
-        <w:t xml:space="preserve">"total_cost"</w:t>
-      </w:r>
-      <w:r>
-        <w:rPr>
-          <w:rStyle w:val="NormalTok"/>
-        </w:rPr>
-        <w:t xml:space="preserve">] </w:t>
-      </w:r>
-      <w:r>
-        <w:rPr>
-          <w:rStyle w:val="OperatorTok"/>
-        </w:rPr>
-        <w:t xml:space="preserve">==</w:t>
-      </w:r>
-      <w:r>
-        <w:rPr>
-          <w:rStyle w:val="NormalTok"/>
-        </w:rPr>
-        <w:t xml:space="preserve"> replay.cost</w:t>
+        <w:t xml:space="preserve"> actions</w:t>
       </w:r>
       <w:r>
         <w:br/>
@@ -8376,7 +8440,7 @@
         <w:rPr>
           <w:lang w:val="vi-VN"/>
         </w:rPr>
-        <w:t xml:space="preserve">. Công thức, SPACE, miền chi phí và ý nghĩa các cột theo P01, đọc ngày 29/10/2026.</w:t>
+        <w:t xml:space="preserve">. Công thức, chọn khối miễn phí, miền chi phí và hai schema CLI/GUI theo P01, đọc ngày 30/10/2026.</w:t>
       </w:r>
     </w:p>
     <w:p>
@@ -8389,6 +8453,44 @@
           <w:lang w:val="vi-VN"/>
         </w:rPr>
         <w:t xml:space="preserve">[2]</w:t>
+      </w:r>
+      <w:r>
+        <w:rPr>
+          <w:lang w:val="vi-VN"/>
+        </w:rPr>
+        <w:t xml:space="preserve"> </w:t>
+      </w:r>
+      <w:r>
+        <w:rPr>
+          <w:rStyle w:val="VerbatimChar"/>
+          <w:lang w:val="vi-VN"/>
+        </w:rPr>
+        <w:t xml:space="preserve">Src/core/board.py</w:t>
+      </w:r>
+      <w:r>
+        <w:rPr>
+          <w:lang w:val="vi-VN"/>
+        </w:rPr>
+        <w:t xml:space="preserve">,</w:t>
+      </w:r>
+      <w:r>
+        <w:rPr>
+          <w:lang w:val="vi-VN"/>
+        </w:rPr>
+        <w:t xml:space="preserve"> </w:t>
+      </w:r>
+      <w:r>
+        <w:rPr>
+          <w:rStyle w:val="VerbatimChar"/>
+          <w:lang w:val="vi-VN"/>
+        </w:rPr>
+        <w:t xml:space="preserve">Src/core/replay.py</w:t>
+      </w:r>
+      <w:r>
+        <w:rPr>
+          <w:lang w:val="vi-VN"/>
+        </w:rPr>
+        <w:t xml:space="preserve">,</w:t>
       </w:r>
       <w:r>
         <w:rPr>

</xml_diff>